<commit_message>
fix(ruta): 12.63 — consistencia final (JR Pass, Narai-juku, checklist) + noches por reservar reales
Priority 1: JR Pass numeric inconsistency fixed in CHECKLIST and docx (6
segments ~¥58k, less than the ¥80k pass, not "roughly equal"). Narai-juku
gets a new SKIPPED category 'pendiente' (open team decision, not a discard).
CHECKLIST gains the 3 missing reservations (Tōshōgū online ticket, Myōryū-ji
phone-only, birthday dinner). Docx: same 3 fixes plus softened the stale
Apr-26 sakura claim.

Priority 2: "Aún por reservar" rewritten. Was showing 3 fixed seed-era
placeholders (hotel_tokyo/kyoto/osaka) with a hardcoded date map, obsolete
since the Ruta. Now driven by NIGHTS (res/amp rows), with real ISO
checkIn/checkOut/nights added as fields 4-6 — shows city + real dates +
night count instead of just "Por reservar".

Suite green.

Co-Authored-By: Claude Sonnet 5 <noreply@anthropic.com>
</commit_message>
<xml_diff>
--- a/Ruta-21-dias.docx
+++ b/Ruta-21-dias.docx
@@ -16174,7 +16174,7 @@
                 <w:sz w:val="19"/>
                 <w:szCs w:val="19"/>
               </w:rPr>
-              <w:t xml:space="preserve">Tren local a Shimo-Yoshida + 400 escalones: LA foto de Japón (pagoda + Fuji). Abril aún puede dar sakura tardío aquí.</w:t>
+              <w:t xml:space="preserve">Tren local a Shimo-Yoshida + 400 escalones: LA foto de Japón (pagoda + Fuji). El sakura de Chūreitō suele haber caído ya para el 26 de abril (pico a mediados de mes): id por la vista, no por la flor.</w:t>
             </w:r>
           </w:p>
         </w:tc>
@@ -19798,7 +19798,7 @@
           <w:sz w:val="19"/>
           <w:szCs w:val="19"/>
         </w:rPr>
-        <w:t xml:space="preserve">Veredicto JR Pass: los tramos JR de largo recorrido suman aproximadamente lo que costaría el pase de 14 días (~¥80.000), pero el pase NO cubre ni el Nozomi ni el Kagayaki (los rápidos que usáis) y los buses de los Alpes, el Tobu de Nikko, el Kintetsu de Nara y el bus del Fuji no son JR de todos modos. Traducción: pagaríais casi lo mismo por ir más lento. Billetes sueltos con smartEX, más simple.</w:t>
+        <w:t xml:space="preserve">Veredicto JR Pass: los tramos JR de largo recorrido suman ~¥58.000/persona en billetes sueltos, MENOS que el pase de 14 días (~¥80.000) — y el pase tampoco cubre ni el Nozomi ni el Kagayaki (los rápidos que usáis), y los buses de los Alpes, el Tobu de Nikko, el Kintetsu de Nara y el bus del Fuji no son JR de todos modos. Traducción: pagaríais MÁS por ir más lento. Billetes sueltos con smartEX, más simple y más barato.</w:t>
       </w:r>
     </w:p>
     <w:p>
@@ -20767,7 +20767,7 @@
           <w:sz w:val="19"/>
           <w:szCs w:val="19"/>
         </w:rPr>
-        <w:t xml:space="preserve">Nota JR Pass: con esta ruta los tramos JR de largo recorrido (Nikko→Kanazawa, Takayama→Kioto, Kioto→Hiroshima, Hiroshima→Hakata, Hakata→Shin-Osaka, Shin-Osaka→Tokio) suman aproximadamente lo que costaría el pase de 14 días, pero los buses de los Alpes y los Kintetsu/Tobu NO son JR: haced la cuenta con calma antes de comprarlo. El pase de 7 días no cubre bien este reparto.</w:t>
+        <w:t xml:space="preserve">Nota JR Pass: con esta ruta los tramos JR de largo recorrido (Nikko→Kanazawa, Takayama→Kioto, Kioto→Hiroshima, Hiroshima→Hakata, Hakata→Shin-Osaka, Shin-Osaka→Tokio) suman ~¥58.000/persona, menos que el pase de 14 días — y los buses de los Alpes y los Kintetsu/Tobu tampoco son JR. El pase de 7 días no cubre bien este reparto.</w:t>
       </w:r>
     </w:p>
     <w:p>

</xml_diff>